<commit_message>
ATL SOP: Audit Report is under Analytics
Co-authored-by: Cursor <cursoragent@cursor.com>
</commit_message>
<xml_diff>
--- a/docs/sop/word/SOP - Assistant Team Leader.docx
+++ b/docs/sop/word/SOP - Assistant Team Leader.docx
@@ -258,7 +258,7 @@
           </w:tcPr>
           <w:p>
             <w:r>
-              <w:t>Audit Report</w:t>
+              <w:t>Analytics &gt; Audit Report</w:t>
             </w:r>
           </w:p>
         </w:tc>
@@ -268,7 +268,7 @@
           </w:tcPr>
           <w:p>
             <w:r>
-              <w:t>Audits managers did on your QC.</w:t>
+              <w:t>Audits managers did on your QC (only your own).</w:t>
             </w:r>
           </w:p>
         </w:tc>

</xml_diff>